<commit_message>
Versão final corrigida de Marcos: RecAdm 0750786-30
Co-Authored-By: Claude Sonnet 5.5 <noreply@anthropic.com>
Claude-Session: https://claude.ai/code/session_01TWDXF1zQjWAy9FHWCVnMWA
</commit_message>
<xml_diff>
--- a/entregas-0750786-zero/RecAdm 0750786-30 Marcos NP arquivamento de reclamação disciplinar contra magistrado falhas pontuais ausência de infração disciplinar.docx
+++ b/entregas-0750786-zero/RecAdm 0750786-30 Marcos NP arquivamento de reclamação disciplinar contra magistrado falhas pontuais ausência de infração disciplinar.docx
@@ -1,15 +1,15 @@
 
 <file path=word/document.xml><?xml version="1.0" encoding="utf-8"?>
-<w:document xmlns:wpc="http://schemas.microsoft.com/office/word/2010/wordprocessingCanvas" xmlns:cx="http://schemas.microsoft.com/office/drawing/2014/chartex" xmlns:cx1="http://schemas.microsoft.com/office/drawing/2015/9/8/chartex" xmlns:cx2="http://schemas.microsoft.com/office/drawing/2015/10/21/chartex" xmlns:cx3="http://schemas.microsoft.com/office/drawing/2016/5/9/chartex" xmlns:cx4="http://schemas.microsoft.com/office/drawing/2016/5/10/chartex" xmlns:cx5="http://schemas.microsoft.com/office/drawing/2016/5/11/chartex" xmlns:cx6="http://schemas.microsoft.com/office/drawing/2016/5/12/chartex" xmlns:cx7="http://schemas.microsoft.com/office/drawing/2016/5/13/chartex" xmlns:cx8="http://schemas.microsoft.com/office/drawing/2016/5/14/chartex" xmlns:mc="http://schemas.openxmlformats.org/markup-compatibility/2006" xmlns:aink="http://schemas.microsoft.com/office/drawing/2016/ink" xmlns:am3d="http://schemas.microsoft.com/office/drawing/2017/model3d" xmlns:o="urn:schemas-microsoft-com:office:office" xmlns:oel="http://schemas.microsoft.com/office/2019/extlst" xmlns:r="http://schemas.openxmlformats.org/officeDocument/2006/relationships" xmlns:m="http://schemas.openxmlformats.org/officeDocument/2006/math" xmlns:v="urn:schemas-microsoft-com:vml" xmlns:wp14="http://schemas.microsoft.com/office/word/2010/wordprocessingDrawing" xmlns:wp="http://schemas.openxmlformats.org/drawingml/2006/wordprocessingDrawing" xmlns:w10="urn:schemas-microsoft-com:office:word" xmlns:w="http://schemas.openxmlformats.org/wordprocessingml/2006/main" xmlns:w14="http://schemas.microsoft.com/office/word/2010/wordml" xmlns:w15="http://schemas.microsoft.com/office/word/2012/wordml" xmlns:w16cex="http://schemas.microsoft.com/office/word/2018/wordml/cex" xmlns:w16cid="http://schemas.microsoft.com/office/word/2016/wordml/cid" xmlns:w16="http://schemas.microsoft.com/office/word/2018/wordml" xmlns:w16du="http://schemas.microsoft.com/office/word/2023/wordml/word16du" xmlns:w16sdtdh="http://schemas.microsoft.com/office/word/2020/wordml/sdtdatahash" xmlns:w16sdtfl="http://schemas.microsoft.com/office/word/2024/wordml/sdtformatlock" xmlns:w16se="http://schemas.microsoft.com/office/word/2015/wordml/symex" xmlns:wpg="http://schemas.microsoft.com/office/word/2010/wordprocessingGroup" xmlns:wpi="http://schemas.microsoft.com/office/word/2010/wordprocessingInk" xmlns:wne="http://schemas.microsoft.com/office/word/2006/wordml" xmlns:wps="http://schemas.microsoft.com/office/word/2010/wordprocessingShape" mc:Ignorable="w14 w15 w16se w16cid w16 w16cex w16sdtdh w16sdtfl w16du wp14">
+<w:document xmlns:wpc="http://schemas.microsoft.com/office/word/2010/wordprocessingCanvas" xmlns:cx="http://schemas.microsoft.com/office/drawing/2014/chartex" xmlns:cx1="http://schemas.microsoft.com/office/drawing/2015/9/8/chartex" xmlns:cx2="http://schemas.microsoft.com/office/drawing/2015/10/21/chartex" xmlns:cx3="http://schemas.microsoft.com/office/drawing/2016/5/9/chartex" xmlns:cx4="http://schemas.microsoft.com/office/drawing/2016/5/10/chartex" xmlns:cx5="http://schemas.microsoft.com/office/drawing/2016/5/11/chartex" xmlns:cx6="http://schemas.microsoft.com/office/drawing/2016/5/12/chartex" xmlns:cx7="http://schemas.microsoft.com/office/drawing/2016/5/13/chartex" xmlns:cx8="http://schemas.microsoft.com/office/drawing/2016/5/14/chartex" xmlns:mc="http://schemas.openxmlformats.org/markup-compatibility/2006" xmlns:aink="http://schemas.microsoft.com/office/drawing/2016/ink" xmlns:am3d="http://schemas.microsoft.com/office/drawing/2017/model3d" xmlns:o="urn:schemas-microsoft-com:office:office" xmlns:oel="http://schemas.microsoft.com/office/2019/extlst" xmlns:r="http://schemas.openxmlformats.org/officeDocument/2006/relationships" xmlns:m="http://schemas.openxmlformats.org/officeDocument/2006/math" xmlns:v="urn:schemas-microsoft-com:vml" xmlns:wp14="http://schemas.microsoft.com/office/word/2010/wordprocessingDrawing" xmlns:wp="http://schemas.openxmlformats.org/drawingml/2006/wordprocessingDrawing" xmlns:w10="urn:schemas-microsoft-com:office:word" xmlns:w="http://schemas.openxmlformats.org/wordprocessingml/2006/main" xmlns:w14="http://schemas.microsoft.com/office/word/2010/wordml" xmlns:w15="http://schemas.microsoft.com/office/word/2012/wordml" xmlns:w16cex="http://schemas.microsoft.com/office/word/2018/wordml/cex" xmlns:w16cid="http://schemas.microsoft.com/office/word/2016/wordml/cid" xmlns:w16="http://schemas.microsoft.com/office/word/2018/wordml" xmlns:w16du="http://schemas.microsoft.com/office/word/2023/wordml/word16du" xmlns:w16sdtdh="http://schemas.microsoft.com/office/word/2020/wordml/sdtdatahash" xmlns:w16sdtfl="http://schemas.microsoft.com/office/word/2024/wordml/sdtformatlock" xmlns:w16se="http://schemas.microsoft.com/office/word/2015/wordml/symex" xmlns:wpg="http://schemas.microsoft.com/office/word/2010/wordprocessingGroup" xmlns:wpi="http://schemas.microsoft.com/office/word/2010/wordprocessingInk" xmlns:wne="http://schemas.microsoft.com/office/word/2006/wordml" xmlns:wps="http://schemas.microsoft.com/office/word/2010/wordprocessingShape" xmlns:a="http://schemas.openxmlformats.org/drawingml/2006/main" xmlns:pic="http://schemas.openxmlformats.org/drawingml/2006/picture" xmlns:a14="http://schemas.microsoft.com/office/drawing/2010/main" mc:Ignorable="w14 w15 w16se w16cid w16 w16cex w16sdtdh w16sdtfl w16du wp14">
   <w:body>
     <w:tbl>
       <w:tblPr>
         <w:tblW w:w="8723" w:type="dxa"/>
         <w:tblBorders>
-          <w:top w:val="outset" w:sz="6" w:space="0" w:color="auto"/>
-          <w:left w:val="outset" w:sz="6" w:space="0" w:color="auto"/>
-          <w:bottom w:val="outset" w:sz="6" w:space="0" w:color="auto"/>
-          <w:right w:val="outset" w:sz="6" w:space="0" w:color="auto"/>
+          <w:top w:val="outset" w:color="auto" w:sz="6" w:space="0"/>
+          <w:left w:val="outset" w:color="auto" w:sz="6" w:space="0"/>
+          <w:bottom w:val="outset" w:color="auto" w:sz="6" w:space="0"/>
+          <w:right w:val="outset" w:color="auto" w:sz="6" w:space="0"/>
         </w:tblBorders>
         <w:tblCellMar>
           <w:left w:w="0" w:type="dxa"/>
@@ -357,10 +357,10 @@
       <w:tr>
         <w:tblPrEx>
           <w:tblBorders>
-            <w:top w:val="none" w:sz="0" w:space="0" w:color="auto"/>
-            <w:left w:val="none" w:sz="0" w:space="0" w:color="auto"/>
-            <w:bottom w:val="none" w:sz="0" w:space="0" w:color="auto"/>
-            <w:right w:val="none" w:sz="0" w:space="0" w:color="auto"/>
+            <w:top w:val="none" w:color="auto" w:sz="0" w:space="0"/>
+            <w:left w:val="none" w:color="auto" w:sz="0" w:space="0"/>
+            <w:bottom w:val="none" w:color="auto" w:sz="0" w:space="0"/>
+            <w:right w:val="none" w:color="auto" w:sz="0" w:space="0"/>
           </w:tblBorders>
           <w:tblCellMar>
             <w:left w:w="108" w:type="dxa"/>
@@ -377,10 +377,10 @@
             <w:tcW w:w="3686" w:type="dxa"/>
             <w:gridSpan w:val="2"/>
             <w:tcBorders>
-              <w:top w:val="single" w:sz="0" w:space="0" w:color="000000" w:themeColor="text1"/>
-              <w:left w:val="single" w:sz="0" w:space="0" w:color="000000" w:themeColor="text1"/>
-              <w:bottom w:val="single" w:sz="0" w:space="0" w:color="000000" w:themeColor="text1"/>
-              <w:right w:val="single" w:sz="0" w:space="0" w:color="000000" w:themeColor="text1"/>
+              <w:top w:val="single" w:color="000000" w:themeColor="text1" w:sz="0" w:space="0"/>
+              <w:left w:val="single" w:color="000000" w:themeColor="text1" w:sz="0" w:space="0"/>
+              <w:bottom w:val="single" w:color="000000" w:themeColor="text1" w:sz="0" w:space="0"/>
+              <w:right w:val="single" w:color="000000" w:themeColor="text1" w:sz="0" w:space="0"/>
             </w:tcBorders>
             <w:vAlign w:val="center"/>
           </w:tcPr>
@@ -406,10 +406,10 @@
           <w:tcPr>
             <w:tcW w:w="447" w:type="dxa"/>
             <w:tcBorders>
-              <w:top w:val="single" w:sz="0" w:space="0" w:color="000000" w:themeColor="text1"/>
-              <w:left w:val="single" w:sz="0" w:space="0" w:color="000000" w:themeColor="text1"/>
-              <w:bottom w:val="single" w:sz="0" w:space="0" w:color="000000" w:themeColor="text1"/>
-              <w:right w:val="single" w:sz="0" w:space="0" w:color="000000" w:themeColor="text1"/>
+              <w:top w:val="single" w:color="000000" w:themeColor="text1" w:sz="0" w:space="0"/>
+              <w:left w:val="single" w:color="000000" w:themeColor="text1" w:sz="0" w:space="0"/>
+              <w:bottom w:val="single" w:color="000000" w:themeColor="text1" w:sz="0" w:space="0"/>
+              <w:right w:val="single" w:color="000000" w:themeColor="text1" w:sz="0" w:space="0"/>
             </w:tcBorders>
             <w:vAlign w:val="center"/>
           </w:tcPr>
@@ -436,10 +436,10 @@
             <w:tcW w:w="4590" w:type="dxa"/>
             <w:gridSpan w:val="2"/>
             <w:tcBorders>
-              <w:top w:val="single" w:sz="0" w:space="0" w:color="000000" w:themeColor="text1"/>
-              <w:left w:val="single" w:sz="0" w:space="0" w:color="000000" w:themeColor="text1"/>
-              <w:bottom w:val="single" w:sz="0" w:space="0" w:color="000000" w:themeColor="text1"/>
-              <w:right w:val="single" w:sz="0" w:space="0" w:color="000000" w:themeColor="text1"/>
+              <w:top w:val="single" w:color="000000" w:themeColor="text1" w:sz="0" w:space="0"/>
+              <w:left w:val="single" w:color="000000" w:themeColor="text1" w:sz="0" w:space="0"/>
+              <w:bottom w:val="single" w:color="000000" w:themeColor="text1" w:sz="0" w:space="0"/>
+              <w:right w:val="single" w:color="000000" w:themeColor="text1" w:sz="0" w:space="0"/>
             </w:tcBorders>
             <w:vAlign w:val="center"/>
           </w:tcPr>
@@ -493,10 +493,10 @@
       <w:tr>
         <w:tblPrEx>
           <w:tblBorders>
-            <w:top w:val="none" w:sz="0" w:space="0" w:color="auto"/>
-            <w:left w:val="none" w:sz="0" w:space="0" w:color="auto"/>
-            <w:bottom w:val="none" w:sz="0" w:space="0" w:color="auto"/>
-            <w:right w:val="none" w:sz="0" w:space="0" w:color="auto"/>
+            <w:top w:val="none" w:color="auto" w:sz="0" w:space="0"/>
+            <w:left w:val="none" w:color="auto" w:sz="0" w:space="0"/>
+            <w:bottom w:val="none" w:color="auto" w:sz="0" w:space="0"/>
+            <w:right w:val="none" w:color="auto" w:sz="0" w:space="0"/>
           </w:tblBorders>
           <w:tblCellMar>
             <w:left w:w="108" w:type="dxa"/>
@@ -513,10 +513,10 @@
             <w:tcW w:w="3686" w:type="dxa"/>
             <w:gridSpan w:val="2"/>
             <w:tcBorders>
-              <w:top w:val="single" w:sz="0" w:space="0" w:color="000000" w:themeColor="text1"/>
-              <w:left w:val="single" w:sz="0" w:space="0" w:color="000000" w:themeColor="text1"/>
-              <w:bottom w:val="single" w:sz="0" w:space="0" w:color="000000" w:themeColor="text1"/>
-              <w:right w:val="single" w:sz="0" w:space="0" w:color="000000" w:themeColor="text1"/>
+              <w:top w:val="single" w:color="000000" w:themeColor="text1" w:sz="0" w:space="0"/>
+              <w:left w:val="single" w:color="000000" w:themeColor="text1" w:sz="0" w:space="0"/>
+              <w:bottom w:val="single" w:color="000000" w:themeColor="text1" w:sz="0" w:space="0"/>
+              <w:right w:val="single" w:color="000000" w:themeColor="text1" w:sz="0" w:space="0"/>
             </w:tcBorders>
             <w:vAlign w:val="center"/>
           </w:tcPr>
@@ -542,10 +542,10 @@
           <w:tcPr>
             <w:tcW w:w="447" w:type="dxa"/>
             <w:tcBorders>
-              <w:top w:val="single" w:sz="0" w:space="0" w:color="000000" w:themeColor="text1"/>
-              <w:left w:val="single" w:sz="0" w:space="0" w:color="000000" w:themeColor="text1"/>
-              <w:bottom w:val="single" w:sz="0" w:space="0" w:color="000000" w:themeColor="text1"/>
-              <w:right w:val="single" w:sz="0" w:space="0" w:color="000000" w:themeColor="text1"/>
+              <w:top w:val="single" w:color="000000" w:themeColor="text1" w:sz="0" w:space="0"/>
+              <w:left w:val="single" w:color="000000" w:themeColor="text1" w:sz="0" w:space="0"/>
+              <w:bottom w:val="single" w:color="000000" w:themeColor="text1" w:sz="0" w:space="0"/>
+              <w:right w:val="single" w:color="000000" w:themeColor="text1" w:sz="0" w:space="0"/>
             </w:tcBorders>
             <w:vAlign w:val="center"/>
           </w:tcPr>
@@ -572,10 +572,10 @@
             <w:tcW w:w="4590" w:type="dxa"/>
             <w:gridSpan w:val="2"/>
             <w:tcBorders>
-              <w:top w:val="single" w:sz="0" w:space="0" w:color="000000" w:themeColor="text1"/>
-              <w:left w:val="single" w:sz="0" w:space="0" w:color="000000" w:themeColor="text1"/>
-              <w:bottom w:val="single" w:sz="0" w:space="0" w:color="000000" w:themeColor="text1"/>
-              <w:right w:val="single" w:sz="0" w:space="0" w:color="000000" w:themeColor="text1"/>
+              <w:top w:val="single" w:color="000000" w:themeColor="text1" w:sz="0" w:space="0"/>
+              <w:left w:val="single" w:color="000000" w:themeColor="text1" w:sz="0" w:space="0"/>
+              <w:bottom w:val="single" w:color="000000" w:themeColor="text1" w:sz="0" w:space="0"/>
+              <w:right w:val="single" w:color="000000" w:themeColor="text1" w:sz="0" w:space="0"/>
             </w:tcBorders>
             <w:vAlign w:val="center"/>
           </w:tcPr>
@@ -645,10 +645,10 @@
       <w:tr>
         <w:tblPrEx>
           <w:tblBorders>
-            <w:top w:val="none" w:sz="0" w:space="0" w:color="auto"/>
-            <w:left w:val="none" w:sz="0" w:space="0" w:color="auto"/>
-            <w:bottom w:val="none" w:sz="0" w:space="0" w:color="auto"/>
-            <w:right w:val="none" w:sz="0" w:space="0" w:color="auto"/>
+            <w:top w:val="none" w:color="auto" w:sz="0" w:space="0"/>
+            <w:left w:val="none" w:color="auto" w:sz="0" w:space="0"/>
+            <w:bottom w:val="none" w:color="auto" w:sz="0" w:space="0"/>
+            <w:right w:val="none" w:color="auto" w:sz="0" w:space="0"/>
           </w:tblBorders>
           <w:tblCellMar>
             <w:left w:w="108" w:type="dxa"/>
@@ -665,10 +665,10 @@
             <w:tcW w:w="3686" w:type="dxa"/>
             <w:gridSpan w:val="2"/>
             <w:tcBorders>
-              <w:top w:val="single" w:sz="0" w:space="0" w:color="000000" w:themeColor="text1"/>
-              <w:left w:val="single" w:sz="0" w:space="0" w:color="000000" w:themeColor="text1"/>
-              <w:bottom w:val="single" w:sz="0" w:space="0" w:color="000000" w:themeColor="text1"/>
-              <w:right w:val="single" w:sz="0" w:space="0" w:color="000000" w:themeColor="text1"/>
+              <w:top w:val="single" w:color="000000" w:themeColor="text1" w:sz="0" w:space="0"/>
+              <w:left w:val="single" w:color="000000" w:themeColor="text1" w:sz="0" w:space="0"/>
+              <w:bottom w:val="single" w:color="000000" w:themeColor="text1" w:sz="0" w:space="0"/>
+              <w:right w:val="single" w:color="000000" w:themeColor="text1" w:sz="0" w:space="0"/>
             </w:tcBorders>
             <w:vAlign w:val="center"/>
           </w:tcPr>
@@ -694,10 +694,10 @@
           <w:tcPr>
             <w:tcW w:w="447" w:type="dxa"/>
             <w:tcBorders>
-              <w:top w:val="single" w:sz="0" w:space="0" w:color="000000" w:themeColor="text1"/>
-              <w:left w:val="single" w:sz="0" w:space="0" w:color="000000" w:themeColor="text1"/>
-              <w:bottom w:val="single" w:sz="0" w:space="0" w:color="000000" w:themeColor="text1"/>
-              <w:right w:val="single" w:sz="0" w:space="0" w:color="000000" w:themeColor="text1"/>
+              <w:top w:val="single" w:color="000000" w:themeColor="text1" w:sz="0" w:space="0"/>
+              <w:left w:val="single" w:color="000000" w:themeColor="text1" w:sz="0" w:space="0"/>
+              <w:bottom w:val="single" w:color="000000" w:themeColor="text1" w:sz="0" w:space="0"/>
+              <w:right w:val="single" w:color="000000" w:themeColor="text1" w:sz="0" w:space="0"/>
             </w:tcBorders>
             <w:vAlign w:val="center"/>
           </w:tcPr>
@@ -724,10 +724,10 @@
             <w:tcW w:w="4590" w:type="dxa"/>
             <w:gridSpan w:val="2"/>
             <w:tcBorders>
-              <w:top w:val="single" w:sz="0" w:space="0" w:color="000000" w:themeColor="text1"/>
-              <w:left w:val="single" w:sz="0" w:space="0" w:color="000000" w:themeColor="text1"/>
-              <w:bottom w:val="single" w:sz="0" w:space="0" w:color="000000" w:themeColor="text1"/>
-              <w:right w:val="single" w:sz="0" w:space="0" w:color="000000" w:themeColor="text1"/>
+              <w:top w:val="single" w:color="000000" w:themeColor="text1" w:sz="0" w:space="0"/>
+              <w:left w:val="single" w:color="000000" w:themeColor="text1" w:sz="0" w:space="0"/>
+              <w:bottom w:val="single" w:color="000000" w:themeColor="text1" w:sz="0" w:space="0"/>
+              <w:right w:val="single" w:color="000000" w:themeColor="text1" w:sz="0" w:space="0"/>
             </w:tcBorders>
             <w:vAlign w:val="center"/>
           </w:tcPr>
@@ -754,10 +754,10 @@
       <w:tr>
         <w:tblPrEx>
           <w:tblBorders>
-            <w:top w:val="none" w:sz="0" w:space="0" w:color="auto"/>
-            <w:left w:val="none" w:sz="0" w:space="0" w:color="auto"/>
-            <w:bottom w:val="none" w:sz="0" w:space="0" w:color="auto"/>
-            <w:right w:val="none" w:sz="0" w:space="0" w:color="auto"/>
+            <w:top w:val="none" w:color="auto" w:sz="0" w:space="0"/>
+            <w:left w:val="none" w:color="auto" w:sz="0" w:space="0"/>
+            <w:bottom w:val="none" w:color="auto" w:sz="0" w:space="0"/>
+            <w:right w:val="none" w:color="auto" w:sz="0" w:space="0"/>
           </w:tblBorders>
           <w:tblCellMar>
             <w:left w:w="108" w:type="dxa"/>
@@ -774,10 +774,10 @@
             <w:tcW w:w="3686" w:type="dxa"/>
             <w:gridSpan w:val="2"/>
             <w:tcBorders>
-              <w:top w:val="single" w:sz="0" w:space="0" w:color="000000" w:themeColor="text1"/>
-              <w:left w:val="single" w:sz="0" w:space="0" w:color="000000" w:themeColor="text1"/>
-              <w:bottom w:val="single" w:sz="0" w:space="0" w:color="000000" w:themeColor="text1"/>
-              <w:right w:val="single" w:sz="0" w:space="0" w:color="000000" w:themeColor="text1"/>
+              <w:top w:val="single" w:color="000000" w:themeColor="text1" w:sz="0" w:space="0"/>
+              <w:left w:val="single" w:color="000000" w:themeColor="text1" w:sz="0" w:space="0"/>
+              <w:bottom w:val="single" w:color="000000" w:themeColor="text1" w:sz="0" w:space="0"/>
+              <w:right w:val="single" w:color="000000" w:themeColor="text1" w:sz="0" w:space="0"/>
             </w:tcBorders>
             <w:vAlign w:val="center"/>
           </w:tcPr>
@@ -794,7 +794,7 @@
             <w:sdt>
               <w:sdtPr>
                 <w:rPr>
-                  <w:rFonts w:ascii="Arial" w:eastAsia="Times New Roman" w:hAnsi="Arial" w:cs="Arial"/>
+                  <w:rFonts w:ascii="Arial" w:hAnsi="Arial" w:eastAsia="Times New Roman" w:cs="Arial"/>
                   <w:sz w:val="28"/>
                   <w:szCs w:val="28"/>
                   <w:lang w:eastAsia="zh-CN"/>
@@ -819,7 +819,7 @@
               <w:sdtContent>
                 <w:r>
                   <w:rPr>
-                    <w:rFonts w:ascii="Arial" w:eastAsia="Times New Roman" w:hAnsi="Arial" w:cs="Arial"/>
+                    <w:rFonts w:ascii="Arial" w:hAnsi="Arial" w:eastAsia="Times New Roman" w:cs="Arial"/>
                     <w:sz w:val="28"/>
                     <w:szCs w:val="28"/>
                     <w:lang w:eastAsia="zh-CN"/>
@@ -842,10 +842,10 @@
           <w:tcPr>
             <w:tcW w:w="447" w:type="dxa"/>
             <w:tcBorders>
-              <w:top w:val="single" w:sz="0" w:space="0" w:color="000000" w:themeColor="text1"/>
-              <w:left w:val="single" w:sz="0" w:space="0" w:color="000000" w:themeColor="text1"/>
-              <w:bottom w:val="single" w:sz="0" w:space="0" w:color="000000" w:themeColor="text1"/>
-              <w:right w:val="single" w:sz="0" w:space="0" w:color="000000" w:themeColor="text1"/>
+              <w:top w:val="single" w:color="000000" w:themeColor="text1" w:sz="0" w:space="0"/>
+              <w:left w:val="single" w:color="000000" w:themeColor="text1" w:sz="0" w:space="0"/>
+              <w:bottom w:val="single" w:color="000000" w:themeColor="text1" w:sz="0" w:space="0"/>
+              <w:right w:val="single" w:color="000000" w:themeColor="text1" w:sz="0" w:space="0"/>
             </w:tcBorders>
             <w:vAlign w:val="center"/>
           </w:tcPr>
@@ -872,10 +872,10 @@
             <w:tcW w:w="4590" w:type="dxa"/>
             <w:gridSpan w:val="2"/>
             <w:tcBorders>
-              <w:top w:val="single" w:sz="0" w:space="0" w:color="000000" w:themeColor="text1"/>
-              <w:left w:val="single" w:sz="0" w:space="0" w:color="000000" w:themeColor="text1"/>
-              <w:bottom w:val="single" w:sz="0" w:space="0" w:color="000000" w:themeColor="text1"/>
-              <w:right w:val="single" w:sz="0" w:space="0" w:color="000000" w:themeColor="text1"/>
+              <w:top w:val="single" w:color="000000" w:themeColor="text1" w:sz="0" w:space="0"/>
+              <w:left w:val="single" w:color="000000" w:themeColor="text1" w:sz="0" w:space="0"/>
+              <w:bottom w:val="single" w:color="000000" w:themeColor="text1" w:sz="0" w:space="0"/>
+              <w:right w:val="single" w:color="000000" w:themeColor="text1" w:sz="0" w:space="0"/>
             </w:tcBorders>
             <w:vAlign w:val="center"/>
           </w:tcPr>
@@ -920,10 +920,10 @@
       <w:tr>
         <w:tblPrEx>
           <w:tblBorders>
-            <w:top w:val="none" w:sz="0" w:space="0" w:color="auto"/>
-            <w:left w:val="none" w:sz="0" w:space="0" w:color="auto"/>
-            <w:bottom w:val="none" w:sz="0" w:space="0" w:color="auto"/>
-            <w:right w:val="none" w:sz="0" w:space="0" w:color="auto"/>
+            <w:top w:val="none" w:color="auto" w:sz="0" w:space="0"/>
+            <w:left w:val="none" w:color="auto" w:sz="0" w:space="0"/>
+            <w:bottom w:val="none" w:color="auto" w:sz="0" w:space="0"/>
+            <w:right w:val="none" w:color="auto" w:sz="0" w:space="0"/>
           </w:tblBorders>
           <w:tblCellMar>
             <w:left w:w="108" w:type="dxa"/>
@@ -940,10 +940,10 @@
             <w:tcW w:w="3686" w:type="dxa"/>
             <w:gridSpan w:val="2"/>
             <w:tcBorders>
-              <w:top w:val="single" w:sz="0" w:space="0" w:color="000000" w:themeColor="text1"/>
-              <w:left w:val="single" w:sz="0" w:space="0" w:color="000000" w:themeColor="text1"/>
-              <w:bottom w:val="single" w:sz="0" w:space="0" w:color="000000" w:themeColor="text1"/>
-              <w:right w:val="single" w:sz="0" w:space="0" w:color="000000" w:themeColor="text1"/>
+              <w:top w:val="single" w:color="000000" w:themeColor="text1" w:sz="0" w:space="0"/>
+              <w:left w:val="single" w:color="000000" w:themeColor="text1" w:sz="0" w:space="0"/>
+              <w:bottom w:val="single" w:color="000000" w:themeColor="text1" w:sz="0" w:space="0"/>
+              <w:right w:val="single" w:color="000000" w:themeColor="text1" w:sz="0" w:space="0"/>
             </w:tcBorders>
             <w:vAlign w:val="center"/>
           </w:tcPr>
@@ -959,7 +959,7 @@
             <w:sdt>
               <w:sdtPr>
                 <w:rPr>
-                  <w:rFonts w:ascii="Arial" w:eastAsia="Times New Roman" w:hAnsi="Arial" w:cs="Arial"/>
+                  <w:rFonts w:ascii="Arial" w:hAnsi="Arial" w:eastAsia="Times New Roman" w:cs="Arial"/>
                   <w:sz w:val="28"/>
                   <w:szCs w:val="28"/>
                   <w:lang w:eastAsia="zh-CN"/>
@@ -983,7 +983,7 @@
               <w:sdtContent>
                 <w:r>
                   <w:rPr>
-                    <w:rFonts w:ascii="Arial" w:eastAsia="Times New Roman" w:hAnsi="Arial" w:cs="Arial"/>
+                    <w:rFonts w:ascii="Arial" w:hAnsi="Arial" w:eastAsia="Times New Roman" w:cs="Arial"/>
                     <w:sz w:val="28"/>
                     <w:szCs w:val="28"/>
                     <w:lang w:eastAsia="zh-CN"/>
@@ -1014,10 +1014,10 @@
           <w:tcPr>
             <w:tcW w:w="447" w:type="dxa"/>
             <w:tcBorders>
-              <w:top w:val="single" w:sz="0" w:space="0" w:color="000000" w:themeColor="text1"/>
-              <w:left w:val="single" w:sz="0" w:space="0" w:color="000000" w:themeColor="text1"/>
-              <w:bottom w:val="single" w:sz="0" w:space="0" w:color="000000" w:themeColor="text1"/>
-              <w:right w:val="single" w:sz="0" w:space="0" w:color="000000" w:themeColor="text1"/>
+              <w:top w:val="single" w:color="000000" w:themeColor="text1" w:sz="0" w:space="0"/>
+              <w:left w:val="single" w:color="000000" w:themeColor="text1" w:sz="0" w:space="0"/>
+              <w:bottom w:val="single" w:color="000000" w:themeColor="text1" w:sz="0" w:space="0"/>
+              <w:right w:val="single" w:color="000000" w:themeColor="text1" w:sz="0" w:space="0"/>
             </w:tcBorders>
             <w:vAlign w:val="center"/>
           </w:tcPr>
@@ -1044,10 +1044,10 @@
             <w:tcW w:w="4590" w:type="dxa"/>
             <w:gridSpan w:val="2"/>
             <w:tcBorders>
-              <w:top w:val="single" w:sz="0" w:space="0" w:color="000000" w:themeColor="text1"/>
-              <w:left w:val="single" w:sz="0" w:space="0" w:color="000000" w:themeColor="text1"/>
-              <w:bottom w:val="single" w:sz="0" w:space="0" w:color="000000" w:themeColor="text1"/>
-              <w:right w:val="single" w:sz="0" w:space="0" w:color="000000" w:themeColor="text1"/>
+              <w:top w:val="single" w:color="000000" w:themeColor="text1" w:sz="0" w:space="0"/>
+              <w:left w:val="single" w:color="000000" w:themeColor="text1" w:sz="0" w:space="0"/>
+              <w:bottom w:val="single" w:color="000000" w:themeColor="text1" w:sz="0" w:space="0"/>
+              <w:right w:val="single" w:color="000000" w:themeColor="text1" w:sz="0" w:space="0"/>
             </w:tcBorders>
             <w:vAlign w:val="center"/>
           </w:tcPr>
@@ -1074,10 +1074,10 @@
       <w:tr>
         <w:tblPrEx>
           <w:tblBorders>
-            <w:top w:val="none" w:sz="0" w:space="0" w:color="auto"/>
-            <w:left w:val="none" w:sz="0" w:space="0" w:color="auto"/>
-            <w:bottom w:val="none" w:sz="0" w:space="0" w:color="auto"/>
-            <w:right w:val="none" w:sz="0" w:space="0" w:color="auto"/>
+            <w:top w:val="none" w:color="auto" w:sz="0" w:space="0"/>
+            <w:left w:val="none" w:color="auto" w:sz="0" w:space="0"/>
+            <w:bottom w:val="none" w:color="auto" w:sz="0" w:space="0"/>
+            <w:right w:val="none" w:color="auto" w:sz="0" w:space="0"/>
           </w:tblBorders>
           <w:tblCellMar>
             <w:left w:w="108" w:type="dxa"/>
@@ -1094,10 +1094,10 @@
             <w:tcW w:w="3686" w:type="dxa"/>
             <w:gridSpan w:val="2"/>
             <w:tcBorders>
-              <w:top w:val="single" w:sz="0" w:space="0" w:color="000000" w:themeColor="text1"/>
-              <w:left w:val="single" w:sz="0" w:space="0" w:color="000000" w:themeColor="text1"/>
-              <w:bottom w:val="single" w:sz="0" w:space="0" w:color="000000" w:themeColor="text1"/>
-              <w:right w:val="single" w:sz="0" w:space="0" w:color="000000" w:themeColor="text1"/>
+              <w:top w:val="single" w:color="000000" w:themeColor="text1" w:sz="0" w:space="0"/>
+              <w:left w:val="single" w:color="000000" w:themeColor="text1" w:sz="0" w:space="0"/>
+              <w:bottom w:val="single" w:color="000000" w:themeColor="text1" w:sz="0" w:space="0"/>
+              <w:right w:val="single" w:color="000000" w:themeColor="text1" w:sz="0" w:space="0"/>
             </w:tcBorders>
             <w:vAlign w:val="center"/>
           </w:tcPr>
@@ -1123,10 +1123,10 @@
           <w:tcPr>
             <w:tcW w:w="447" w:type="dxa"/>
             <w:tcBorders>
-              <w:top w:val="single" w:sz="0" w:space="0" w:color="000000" w:themeColor="text1"/>
-              <w:left w:val="single" w:sz="0" w:space="0" w:color="000000" w:themeColor="text1"/>
-              <w:bottom w:val="single" w:sz="0" w:space="0" w:color="000000" w:themeColor="text1"/>
-              <w:right w:val="single" w:sz="0" w:space="0" w:color="000000" w:themeColor="text1"/>
+              <w:top w:val="single" w:color="000000" w:themeColor="text1" w:sz="0" w:space="0"/>
+              <w:left w:val="single" w:color="000000" w:themeColor="text1" w:sz="0" w:space="0"/>
+              <w:bottom w:val="single" w:color="000000" w:themeColor="text1" w:sz="0" w:space="0"/>
+              <w:right w:val="single" w:color="000000" w:themeColor="text1" w:sz="0" w:space="0"/>
             </w:tcBorders>
             <w:vAlign w:val="center"/>
           </w:tcPr>
@@ -1154,10 +1154,10 @@
             <w:tcW w:w="4590" w:type="dxa"/>
             <w:gridSpan w:val="2"/>
             <w:tcBorders>
-              <w:top w:val="single" w:sz="0" w:space="0" w:color="000000" w:themeColor="text1"/>
-              <w:left w:val="single" w:sz="0" w:space="0" w:color="000000" w:themeColor="text1"/>
-              <w:bottom w:val="single" w:sz="0" w:space="0" w:color="000000" w:themeColor="text1"/>
-              <w:right w:val="single" w:sz="0" w:space="0" w:color="000000" w:themeColor="text1"/>
+              <w:top w:val="single" w:color="000000" w:themeColor="text1" w:sz="0" w:space="0"/>
+              <w:left w:val="single" w:color="000000" w:themeColor="text1" w:sz="0" w:space="0"/>
+              <w:bottom w:val="single" w:color="000000" w:themeColor="text1" w:sz="0" w:space="0"/>
+              <w:right w:val="single" w:color="000000" w:themeColor="text1" w:sz="0" w:space="0"/>
             </w:tcBorders>
             <w:vAlign w:val="center"/>
           </w:tcPr>
@@ -1594,15 +1594,15 @@
         <w:spacing w:after="0" w:line="360" w:lineRule="auto"/>
         <w:jc w:val="both"/>
         <w:rPr>
-          <w:rFonts w:ascii="Arial" w:eastAsia="Arial" w:hAnsi="Arial" w:cs="Arial"/>
-          <w:color w:val="808080" w:themeColor="background1" w:themeShade="80"/>
-          <w:sz w:val="28"/>
-          <w:szCs w:val="28"/>
-        </w:rPr>
-      </w:pPr>
-      <w:r>
-        <w:rPr>
-          <w:rFonts w:ascii="Arial" w:eastAsia="Arial" w:hAnsi="Arial" w:cs="Arial"/>
+          <w:rFonts w:ascii="Arial" w:hAnsi="Arial" w:eastAsia="Arial" w:cs="Arial"/>
+          <w:color w:val="808080" w:themeColor="background1" w:themeShade="80"/>
+          <w:sz w:val="28"/>
+          <w:szCs w:val="28"/>
+        </w:rPr>
+      </w:pPr>
+      <w:r>
+        <w:rPr>
+          <w:rFonts w:ascii="Arial" w:hAnsi="Arial" w:eastAsia="Arial" w:cs="Arial"/>
           <w:color w:val="808080" w:themeColor="background1" w:themeShade="80"/>
           <w:sz w:val="28"/>
           <w:szCs w:val="28"/>
@@ -1616,15 +1616,15 @@
         <w:spacing w:after="0" w:line="360" w:lineRule="auto"/>
         <w:jc w:val="both"/>
         <w:rPr>
-          <w:rFonts w:ascii="Arial" w:eastAsia="Arial" w:hAnsi="Arial" w:cs="Arial"/>
-          <w:color w:val="808080" w:themeColor="background1" w:themeShade="80"/>
-          <w:sz w:val="28"/>
-          <w:szCs w:val="28"/>
-        </w:rPr>
-      </w:pPr>
-      <w:r>
-        <w:rPr>
-          <w:rFonts w:ascii="Arial" w:eastAsia="Arial" w:hAnsi="Arial" w:cs="Arial"/>
+          <w:rFonts w:ascii="Arial" w:hAnsi="Arial" w:eastAsia="Arial" w:cs="Arial"/>
+          <w:color w:val="808080" w:themeColor="background1" w:themeShade="80"/>
+          <w:sz w:val="28"/>
+          <w:szCs w:val="28"/>
+        </w:rPr>
+      </w:pPr>
+      <w:r>
+        <w:rPr>
+          <w:rFonts w:ascii="Arial" w:hAnsi="Arial" w:eastAsia="Arial" w:cs="Arial"/>
           <w:color w:val="808080" w:themeColor="background1" w:themeShade="80"/>
           <w:sz w:val="28"/>
           <w:szCs w:val="28"/>
@@ -1637,7 +1637,7 @@
         <w:spacing w:after="0" w:line="360" w:lineRule="auto"/>
         <w:jc w:val="both"/>
         <w:rPr>
-          <w:rFonts w:ascii="Arial" w:eastAsia="Arial" w:hAnsi="Arial" w:cs="Arial"/>
+          <w:rFonts w:ascii="Arial" w:hAnsi="Arial" w:eastAsia="Arial" w:cs="Arial"/>
           <w:color w:val="808080" w:themeColor="background1" w:themeShade="80"/>
           <w:sz w:val="26"/>
           <w:szCs w:val="26"/>
@@ -1645,7 +1645,7 @@
       </w:pPr>
       <w:r>
         <w:rPr>
-          <w:rFonts w:ascii="Arial" w:eastAsia="Arial" w:hAnsi="Arial" w:cs="Arial"/>
+          <w:rFonts w:ascii="Arial" w:hAnsi="Arial" w:eastAsia="Arial" w:cs="Arial"/>
           <w:i/>
           <w:iCs/>
           <w:color w:val="808080" w:themeColor="background1" w:themeShade="80"/>
@@ -3478,7 +3478,7 @@
     </w:p>
     <w:p>
       <w:pPr>
-        <w:keepNext/>
+        <w:keepNext w:val="1"/>
         <w:spacing w:after="0" w:line="360" w:lineRule="auto"/>
         <w:ind w:hanging="142"/>
         <w:jc w:val="center"/>
@@ -3492,7 +3492,7 @@
       <w:r>
         <w:rPr>
           <w:rFonts w:ascii="Arial" w:hAnsi="Arial" w:cs="Arial"/>
-          <w:color w:val="808080" w:themeColor="background1" w:themeShade="80"/>
+          <w:color w:val="808080" w:themeColor="background1" w:themeTint="FF" w:themeShade="80"/>
           <w:sz w:val="28"/>
           <w:szCs w:val="28"/>
           <w:highlight w:val="yellow"/>
@@ -3502,17 +3502,37 @@
       <w:r>
         <w:rPr>
           <w:rFonts w:ascii="Arial" w:hAnsi="Arial" w:cs="Arial"/>
-          <w:color w:val="808080" w:themeColor="background1" w:themeShade="80"/>
+          <w:color w:val="808080" w:themeColor="background1" w:themeTint="FF" w:themeShade="80"/>
           <w:sz w:val="28"/>
           <w:szCs w:val="28"/>
           <w:highlight w:val="yellow"/>
         </w:rPr>
-        <w:t xml:space="preserve"> ALEÇÃO DE</w:t>
-      </w:r>
-      <w:r>
-        <w:rPr>
-          <w:rFonts w:ascii="Arial" w:hAnsi="Arial" w:cs="Arial"/>
-          <w:color w:val="808080" w:themeColor="background1" w:themeShade="80"/>
+        <w:t xml:space="preserve"> ALE</w:t>
+      </w:r>
+      <w:r>
+        <w:rPr>
+          <w:rFonts w:ascii="Arial" w:hAnsi="Arial" w:cs="Arial"/>
+          <w:color w:val="808080" w:themeColor="background1" w:themeTint="FF" w:themeShade="80"/>
+          <w:sz w:val="28"/>
+          <w:szCs w:val="28"/>
+          <w:highlight w:val="yellow"/>
+        </w:rPr>
+        <w:t>GA</w:t>
+      </w:r>
+      <w:r>
+        <w:rPr>
+          <w:rFonts w:ascii="Arial" w:hAnsi="Arial" w:cs="Arial"/>
+          <w:color w:val="808080" w:themeColor="background1" w:themeTint="FF" w:themeShade="80"/>
+          <w:sz w:val="28"/>
+          <w:szCs w:val="28"/>
+          <w:highlight w:val="yellow"/>
+        </w:rPr>
+        <w:t>ÇÃO DE</w:t>
+      </w:r>
+      <w:r>
+        <w:rPr>
+          <w:rFonts w:ascii="Arial" w:hAnsi="Arial" w:cs="Arial"/>
+          <w:color w:val="808080" w:themeColor="background1" w:themeTint="FF" w:themeShade="80"/>
           <w:sz w:val="28"/>
           <w:szCs w:val="28"/>
           <w:highlight w:val="yellow"/>
@@ -4944,16 +4964,16 @@
       <w:r>
         <w:rPr>
           <w:rFonts w:ascii="Arial" w:hAnsi="Arial" w:cs="Arial"/>
-          <w:color w:val="808080" w:themeColor="background1" w:themeShade="80"/>
-          <w:sz w:val="28"/>
-          <w:szCs w:val="28"/>
-        </w:rPr>
-        <w:t>De certo, o</w:t>
-      </w:r>
-      <w:r>
-        <w:rPr>
-          <w:rFonts w:ascii="Arial" w:hAnsi="Arial" w:cs="Arial"/>
-          <w:color w:val="808080" w:themeColor="background1" w:themeShade="80"/>
+          <w:color w:val="808080" w:themeColor="background1" w:themeTint="FF" w:themeShade="80"/>
+          <w:sz w:val="28"/>
+          <w:szCs w:val="28"/>
+        </w:rPr>
+        <w:t>Decerto, o</w:t>
+      </w:r>
+      <w:r>
+        <w:rPr>
+          <w:rFonts w:ascii="Arial" w:hAnsi="Arial" w:cs="Arial"/>
+          <w:color w:val="808080" w:themeColor="background1" w:themeTint="FF" w:themeShade="80"/>
           <w:sz w:val="28"/>
           <w:szCs w:val="28"/>
         </w:rPr>
@@ -6975,7 +6995,7 @@
     </w:p>
     <w:sectPr>
       <w:footerReference w:type="default" r:id="rId15"/>
-      <w:pgSz w:w="11906" w:h="16838"/>
+      <w:pgSz w:w="11906" w:h="16838" w:orient="portrait"/>
       <w:pgMar w:top="1417" w:right="1701" w:bottom="1417" w:left="1701" w:header="708" w:footer="708" w:gutter="0"/>
       <w:cols w:space="708"/>
       <w:docGrid w:linePitch="360"/>
@@ -6986,7 +7006,7 @@
 
 <file path=word/comments.xml><?xml version="1.0" encoding="utf-8"?>
 <w:comments xmlns:wpc="http://schemas.microsoft.com/office/word/2010/wordprocessingCanvas" xmlns:cx="http://schemas.microsoft.com/office/drawing/2014/chartex" xmlns:cx1="http://schemas.microsoft.com/office/drawing/2015/9/8/chartex" xmlns:cx2="http://schemas.microsoft.com/office/drawing/2015/10/21/chartex" xmlns:cx3="http://schemas.microsoft.com/office/drawing/2016/5/9/chartex" xmlns:cx4="http://schemas.microsoft.com/office/drawing/2016/5/10/chartex" xmlns:cx5="http://schemas.microsoft.com/office/drawing/2016/5/11/chartex" xmlns:cx6="http://schemas.microsoft.com/office/drawing/2016/5/12/chartex" xmlns:cx7="http://schemas.microsoft.com/office/drawing/2016/5/13/chartex" xmlns:cx8="http://schemas.microsoft.com/office/drawing/2016/5/14/chartex" xmlns:mc="http://schemas.openxmlformats.org/markup-compatibility/2006" xmlns:aink="http://schemas.microsoft.com/office/drawing/2016/ink" xmlns:am3d="http://schemas.microsoft.com/office/drawing/2017/model3d" xmlns:o="urn:schemas-microsoft-com:office:office" xmlns:oel="http://schemas.microsoft.com/office/2019/extlst" xmlns:r="http://schemas.openxmlformats.org/officeDocument/2006/relationships" xmlns:m="http://schemas.openxmlformats.org/officeDocument/2006/math" xmlns:v="urn:schemas-microsoft-com:vml" xmlns:wp14="http://schemas.microsoft.com/office/word/2010/wordprocessingDrawing" xmlns:wp="http://schemas.openxmlformats.org/drawingml/2006/wordprocessingDrawing" xmlns:w10="urn:schemas-microsoft-com:office:word" xmlns:w="http://schemas.openxmlformats.org/wordprocessingml/2006/main" xmlns:w14="http://schemas.microsoft.com/office/word/2010/wordml" xmlns:w15="http://schemas.microsoft.com/office/word/2012/wordml" xmlns:w16cex="http://schemas.microsoft.com/office/word/2018/wordml/cex" xmlns:w16cid="http://schemas.microsoft.com/office/word/2016/wordml/cid" xmlns:w16="http://schemas.microsoft.com/office/word/2018/wordml" xmlns:w16du="http://schemas.microsoft.com/office/word/2023/wordml/word16du" xmlns:w16sdtdh="http://schemas.microsoft.com/office/word/2020/wordml/sdtdatahash" xmlns:w16sdtfl="http://schemas.microsoft.com/office/word/2024/wordml/sdtformatlock" xmlns:w16se="http://schemas.microsoft.com/office/word/2015/wordml/symex" xmlns:wpg="http://schemas.microsoft.com/office/word/2010/wordprocessingGroup" xmlns:wpi="http://schemas.microsoft.com/office/word/2010/wordprocessingInk" xmlns:wne="http://schemas.microsoft.com/office/word/2006/wordml" xmlns:wps="http://schemas.microsoft.com/office/word/2010/wordprocessingShape" mc:Ignorable="w14 w15 w16se w16cid w16 w16cex w16sdtdh w16sdtfl w16du wp14">
-  <w:comment w:id="0" w:author="Marcos Dwayne Saraiva Costa - GDSXSR" w:date="2026-10-28T15:40:00Z" w:initials="MD">
+  <w:comment w:initials="MD" w:author="Marcos Dwayne Saraiva Costa - GDSXSR" w:date="2026-10-28T15:40:00Z" w:id="0">
     <w:p>
       <w:pPr>
         <w:pStyle w:val="Textodecomentrio"/>
@@ -7052,7 +7072,7 @@
       </w:r>
     </w:p>
   </w:comment>
-  <w:comment w:id="1" w:author="Marcos Dwayne Saraiva Costa - GDSXSR" w:date="2026-10-28T15:39:00Z" w:initials="MD">
+  <w:comment w:initials="MD" w:author="Marcos Dwayne Saraiva Costa - GDSXSR" w:date="2026-10-28T15:39:00Z" w:id="1">
     <w:p>
       <w:pPr>
         <w:pStyle w:val="Textodecomentrio"/>
@@ -7068,7 +7088,7 @@
       </w:r>
     </w:p>
   </w:comment>
-  <w:comment w:id="3" w:author="Assessor GDSXSR" w:date="2026-10-28T18:16:00Z" w:initials="AG">
+  <w:comment w:initials="AG" w:author="Assessor GDSXSR" w:date="2026-10-28T18:16:00Z" w:id="3">
     <w:p>
       <w:pPr>
         <w:pStyle w:val="Textodecomentrio"/>
@@ -7107,7 +7127,7 @@
       </w:r>
     </w:p>
   </w:comment>
-  <w:comment w:id="2" w:author="Assessor GDSXSR" w:date="2026-10-28T18:16:00Z" w:initials="AG">
+  <w:comment w:initials="AG" w:author="Assessor GDSXSR" w:date="2026-10-28T18:16:00Z" w:id="2">
     <w:p>
       <w:r>
         <w:annotationRef/>
@@ -7117,7 +7137,7 @@
       </w:r>
     </w:p>
   </w:comment>
-  <w:comment w:id="4" w:author="Marcos Dwayne Saraiva Costa - GDSXSR" w:date="2026-10-28T15:38:00Z" w:initials="MD">
+  <w:comment w:initials="MD" w:author="Marcos Dwayne Saraiva Costa - GDSXSR" w:date="2026-10-28T15:38:00Z" w:id="4">
     <w:p>
       <w:pPr>
         <w:pStyle w:val="Textodecomentrio"/>
@@ -7133,7 +7153,7 @@
       </w:r>
     </w:p>
   </w:comment>
-  <w:comment w:id="5" w:author="Assessor GDSXSR" w:date="2026-10-28T18:16:00Z" w:initials="AG">
+  <w:comment w:initials="AG" w:author="Assessor GDSXSR" w:date="2026-10-28T18:16:00Z" w:id="5">
     <w:p>
       <w:r>
         <w:annotationRef/>
@@ -8071,7 +8091,7 @@
   <w:docDefaults>
     <w:rPrDefault>
       <w:rPr>
-        <w:rFonts w:asciiTheme="minorHAnsi" w:eastAsiaTheme="minorHAnsi" w:hAnsiTheme="minorHAnsi" w:cstheme="minorBidi"/>
+        <w:rFonts w:asciiTheme="minorHAnsi" w:hAnsiTheme="minorHAnsi" w:eastAsiaTheme="minorHAnsi" w:cstheme="minorBidi"/>
         <w:sz w:val="22"/>
         <w:szCs w:val="22"/>
         <w:lang w:val="pt-BR" w:eastAsia="en-US" w:bidi="ar-SA"/>
@@ -8086,14 +8106,14 @@
   <w:latentStyles w:defLockedState="0" w:defUIPriority="99" w:defSemiHidden="0" w:defUnhideWhenUsed="0" w:defQFormat="0" w:count="376">
     <w:lsdException w:name="Normal" w:uiPriority="0" w:qFormat="1"/>
     <w:lsdException w:name="heading 1" w:uiPriority="0"/>
-    <w:lsdException w:name="heading 2" w:semiHidden="1" w:uiPriority="9" w:unhideWhenUsed="1"/>
-    <w:lsdException w:name="heading 3" w:semiHidden="1" w:uiPriority="9" w:unhideWhenUsed="1" w:qFormat="1"/>
-    <w:lsdException w:name="heading 4" w:semiHidden="1" w:uiPriority="9" w:unhideWhenUsed="1" w:qFormat="1"/>
-    <w:lsdException w:name="heading 5" w:semiHidden="1" w:uiPriority="9" w:unhideWhenUsed="1" w:qFormat="1"/>
-    <w:lsdException w:name="heading 6" w:semiHidden="1" w:uiPriority="9" w:unhideWhenUsed="1" w:qFormat="1"/>
-    <w:lsdException w:name="heading 7" w:semiHidden="1" w:uiPriority="9" w:unhideWhenUsed="1" w:qFormat="1"/>
-    <w:lsdException w:name="heading 8" w:semiHidden="1" w:uiPriority="9" w:unhideWhenUsed="1" w:qFormat="1"/>
-    <w:lsdException w:name="heading 9" w:semiHidden="1" w:uiPriority="9" w:unhideWhenUsed="1" w:qFormat="1"/>
+    <w:lsdException w:name="heading 2" w:uiPriority="9" w:semiHidden="1" w:unhideWhenUsed="1"/>
+    <w:lsdException w:name="heading 3" w:uiPriority="9" w:semiHidden="1" w:unhideWhenUsed="1" w:qFormat="1"/>
+    <w:lsdException w:name="heading 4" w:uiPriority="9" w:semiHidden="1" w:unhideWhenUsed="1" w:qFormat="1"/>
+    <w:lsdException w:name="heading 5" w:uiPriority="9" w:semiHidden="1" w:unhideWhenUsed="1" w:qFormat="1"/>
+    <w:lsdException w:name="heading 6" w:uiPriority="9" w:semiHidden="1" w:unhideWhenUsed="1" w:qFormat="1"/>
+    <w:lsdException w:name="heading 7" w:uiPriority="9" w:semiHidden="1" w:unhideWhenUsed="1" w:qFormat="1"/>
+    <w:lsdException w:name="heading 8" w:uiPriority="9" w:semiHidden="1" w:unhideWhenUsed="1" w:qFormat="1"/>
+    <w:lsdException w:name="heading 9" w:uiPriority="9" w:semiHidden="1" w:unhideWhenUsed="1" w:qFormat="1"/>
     <w:lsdException w:name="index 1" w:semiHidden="1" w:unhideWhenUsed="1"/>
     <w:lsdException w:name="index 2" w:semiHidden="1" w:unhideWhenUsed="1"/>
     <w:lsdException w:name="index 3" w:semiHidden="1" w:unhideWhenUsed="1"/>
@@ -8103,22 +8123,22 @@
     <w:lsdException w:name="index 7" w:semiHidden="1" w:unhideWhenUsed="1"/>
     <w:lsdException w:name="index 8" w:semiHidden="1" w:unhideWhenUsed="1"/>
     <w:lsdException w:name="index 9" w:semiHidden="1" w:unhideWhenUsed="1"/>
-    <w:lsdException w:name="toc 1" w:semiHidden="1" w:uiPriority="39" w:unhideWhenUsed="1"/>
-    <w:lsdException w:name="toc 2" w:semiHidden="1" w:uiPriority="39" w:unhideWhenUsed="1"/>
-    <w:lsdException w:name="toc 3" w:semiHidden="1" w:uiPriority="39" w:unhideWhenUsed="1"/>
-    <w:lsdException w:name="toc 4" w:semiHidden="1" w:uiPriority="39" w:unhideWhenUsed="1"/>
-    <w:lsdException w:name="toc 5" w:semiHidden="1" w:uiPriority="39" w:unhideWhenUsed="1"/>
-    <w:lsdException w:name="toc 6" w:semiHidden="1" w:uiPriority="39" w:unhideWhenUsed="1"/>
-    <w:lsdException w:name="toc 7" w:semiHidden="1" w:uiPriority="39" w:unhideWhenUsed="1"/>
-    <w:lsdException w:name="toc 8" w:semiHidden="1" w:uiPriority="39" w:unhideWhenUsed="1"/>
-    <w:lsdException w:name="toc 9" w:semiHidden="1" w:uiPriority="39" w:unhideWhenUsed="1"/>
+    <w:lsdException w:name="toc 1" w:uiPriority="39" w:semiHidden="1" w:unhideWhenUsed="1"/>
+    <w:lsdException w:name="toc 2" w:uiPriority="39" w:semiHidden="1" w:unhideWhenUsed="1"/>
+    <w:lsdException w:name="toc 3" w:uiPriority="39" w:semiHidden="1" w:unhideWhenUsed="1"/>
+    <w:lsdException w:name="toc 4" w:uiPriority="39" w:semiHidden="1" w:unhideWhenUsed="1"/>
+    <w:lsdException w:name="toc 5" w:uiPriority="39" w:semiHidden="1" w:unhideWhenUsed="1"/>
+    <w:lsdException w:name="toc 6" w:uiPriority="39" w:semiHidden="1" w:unhideWhenUsed="1"/>
+    <w:lsdException w:name="toc 7" w:uiPriority="39" w:semiHidden="1" w:unhideWhenUsed="1"/>
+    <w:lsdException w:name="toc 8" w:uiPriority="39" w:semiHidden="1" w:unhideWhenUsed="1"/>
+    <w:lsdException w:name="toc 9" w:uiPriority="39" w:semiHidden="1" w:unhideWhenUsed="1"/>
     <w:lsdException w:name="Normal Indent" w:semiHidden="1" w:unhideWhenUsed="1"/>
     <w:lsdException w:name="footnote text" w:semiHidden="1" w:unhideWhenUsed="1"/>
     <w:lsdException w:name="annotation text" w:semiHidden="1" w:unhideWhenUsed="1"/>
     <w:lsdException w:name="header" w:semiHidden="1" w:unhideWhenUsed="1"/>
     <w:lsdException w:name="footer" w:semiHidden="1" w:unhideWhenUsed="1"/>
     <w:lsdException w:name="index heading" w:semiHidden="1" w:unhideWhenUsed="1"/>
-    <w:lsdException w:name="caption" w:semiHidden="1" w:uiPriority="35" w:unhideWhenUsed="1" w:qFormat="1"/>
+    <w:lsdException w:name="caption" w:uiPriority="35" w:semiHidden="1" w:unhideWhenUsed="1" w:qFormat="1"/>
     <w:lsdException w:name="table of figures" w:semiHidden="1" w:unhideWhenUsed="1"/>
     <w:lsdException w:name="envelope address" w:semiHidden="1" w:unhideWhenUsed="1"/>
     <w:lsdException w:name="envelope return" w:semiHidden="1" w:unhideWhenUsed="1"/>
@@ -8149,7 +8169,7 @@
     <w:lsdException w:name="Title" w:uiPriority="10"/>
     <w:lsdException w:name="Closing" w:semiHidden="1" w:unhideWhenUsed="1"/>
     <w:lsdException w:name="Signature" w:semiHidden="1" w:unhideWhenUsed="1"/>
-    <w:lsdException w:name="Default Paragraph Font" w:semiHidden="1" w:uiPriority="1" w:unhideWhenUsed="1"/>
+    <w:lsdException w:name="Default Paragraph Font" w:uiPriority="1" w:semiHidden="1" w:unhideWhenUsed="1"/>
     <w:lsdException w:name="Body Text" w:semiHidden="1" w:unhideWhenUsed="1"/>
     <w:lsdException w:name="Body Text Indent" w:semiHidden="1" w:unhideWhenUsed="1"/>
     <w:lsdException w:name="List Continue" w:semiHidden="1" w:unhideWhenUsed="1"/>
@@ -8349,8 +8369,8 @@
     <w:lsdException w:name="Subtle Reference" w:uiPriority="31"/>
     <w:lsdException w:name="Intense Reference" w:uiPriority="32"/>
     <w:lsdException w:name="Book Title" w:uiPriority="33"/>
-    <w:lsdException w:name="Bibliography" w:semiHidden="1" w:uiPriority="37" w:unhideWhenUsed="1"/>
-    <w:lsdException w:name="TOC Heading" w:semiHidden="1" w:uiPriority="39" w:unhideWhenUsed="1" w:qFormat="1"/>
+    <w:lsdException w:name="Bibliography" w:uiPriority="37" w:semiHidden="1" w:unhideWhenUsed="1"/>
+    <w:lsdException w:name="TOC Heading" w:uiPriority="39" w:semiHidden="1" w:unhideWhenUsed="1" w:qFormat="1"/>
     <w:lsdException w:name="Plain Table 1" w:uiPriority="41"/>
     <w:lsdException w:name="Plain Table 2" w:uiPriority="42"/>
     <w:lsdException w:name="Plain Table 3" w:uiPriority="43"/>
@@ -8461,7 +8481,7 @@
     <w:lsdException w:name="Unresolved Mention" w:semiHidden="1" w:unhideWhenUsed="1"/>
     <w:lsdException w:name="Smart Link" w:semiHidden="1" w:unhideWhenUsed="1"/>
   </w:latentStyles>
-  <w:style w:type="paragraph" w:default="1" w:styleId="Normal">
+  <w:style w:type="paragraph" w:styleId="Normal" w:default="1">
     <w:name w:val="Normal"/>
     <w:qFormat/>
     <w:rsid w:val="002C2464"/>
@@ -8479,7 +8499,7 @@
       <w:outlineLvl w:val="0"/>
     </w:pPr>
     <w:rPr>
-      <w:rFonts w:ascii="Arial" w:eastAsia="Times New Roman" w:hAnsi="Arial" w:cs="Times New Roman"/>
+      <w:rFonts w:ascii="Arial" w:hAnsi="Arial" w:eastAsia="Times New Roman" w:cs="Times New Roman"/>
       <w:b/>
       <w:sz w:val="24"/>
       <w:szCs w:val="20"/>
@@ -8502,18 +8522,18 @@
       <w:outlineLvl w:val="1"/>
     </w:pPr>
     <w:rPr>
-      <w:rFonts w:asciiTheme="majorHAnsi" w:eastAsiaTheme="majorEastAsia" w:hAnsiTheme="majorHAnsi" w:cstheme="majorBidi"/>
+      <w:rFonts w:asciiTheme="majorHAnsi" w:hAnsiTheme="majorHAnsi" w:eastAsiaTheme="majorEastAsia" w:cstheme="majorBidi"/>
       <w:color w:val="2F5496" w:themeColor="accent1" w:themeShade="BF"/>
       <w:sz w:val="26"/>
       <w:szCs w:val="26"/>
     </w:rPr>
   </w:style>
-  <w:style w:type="character" w:default="1" w:styleId="Fontepargpadro">
+  <w:style w:type="character" w:styleId="Fontepargpadro" w:default="1">
     <w:name w:val="Default Paragraph Font"/>
     <w:uiPriority w:val="1"/>
     <w:unhideWhenUsed/>
   </w:style>
-  <w:style w:type="table" w:default="1" w:styleId="Tabelanormal">
+  <w:style w:type="table" w:styleId="Tabelanormal" w:default="1">
     <w:name w:val="Normal Table"/>
     <w:uiPriority w:val="99"/>
     <w:semiHidden/>
@@ -8528,7 +8548,7 @@
       </w:tblCellMar>
     </w:tblPr>
   </w:style>
-  <w:style w:type="numbering" w:default="1" w:styleId="Semlista">
+  <w:style w:type="numbering" w:styleId="Semlista" w:default="1">
     <w:name w:val="No List"/>
     <w:uiPriority w:val="99"/>
     <w:semiHidden/>
@@ -8545,7 +8565,7 @@
       <w:spacing w:before="100" w:beforeAutospacing="1" w:after="100" w:afterAutospacing="1" w:line="240" w:lineRule="auto"/>
     </w:pPr>
     <w:rPr>
-      <w:rFonts w:ascii="Times New Roman" w:eastAsia="Times New Roman" w:hAnsi="Times New Roman" w:cs="Times New Roman"/>
+      <w:rFonts w:ascii="Times New Roman" w:hAnsi="Times New Roman" w:eastAsia="Times New Roman" w:cs="Times New Roman"/>
       <w:sz w:val="24"/>
       <w:szCs w:val="24"/>
       <w:lang w:eastAsia="pt-BR"/>
@@ -8590,20 +8610,20 @@
       <w:spacing w:after="0" w:line="240" w:lineRule="auto"/>
     </w:pPr>
     <w:rPr>
-      <w:rFonts w:ascii="Verdana" w:eastAsia="Times New Roman" w:hAnsi="Verdana" w:cs="Times New Roman"/>
+      <w:rFonts w:ascii="Verdana" w:hAnsi="Verdana" w:eastAsia="Times New Roman" w:cs="Times New Roman"/>
       <w:sz w:val="20"/>
       <w:szCs w:val="20"/>
       <w:lang w:val="x-none" w:eastAsia="x-none"/>
     </w:rPr>
   </w:style>
-  <w:style w:type="character" w:customStyle="1" w:styleId="TextodecomentrioChar">
+  <w:style w:type="character" w:styleId="TextodecomentrioChar" w:customStyle="1">
     <w:name w:val="Texto de comentário Char"/>
     <w:basedOn w:val="Fontepargpadro"/>
     <w:link w:val="Textodecomentrio"/>
     <w:uiPriority w:val="99"/>
     <w:rsid w:val="002D3FF3"/>
     <w:rPr>
-      <w:rFonts w:ascii="Verdana" w:eastAsia="Times New Roman" w:hAnsi="Verdana" w:cs="Times New Roman"/>
+      <w:rFonts w:ascii="Verdana" w:hAnsi="Verdana" w:eastAsia="Times New Roman" w:cs="Times New Roman"/>
       <w:sz w:val="20"/>
       <w:szCs w:val="20"/>
       <w:lang w:val="x-none" w:eastAsia="x-none"/>
@@ -8622,13 +8642,13 @@
       <w:spacing w:after="160"/>
     </w:pPr>
     <w:rPr>
-      <w:rFonts w:asciiTheme="minorHAnsi" w:eastAsiaTheme="minorHAnsi" w:hAnsiTheme="minorHAnsi" w:cstheme="minorBidi"/>
+      <w:rFonts w:asciiTheme="minorHAnsi" w:hAnsiTheme="minorHAnsi" w:eastAsiaTheme="minorHAnsi" w:cstheme="minorBidi"/>
       <w:b/>
       <w:bCs/>
       <w:lang w:val="pt-BR" w:eastAsia="en-US"/>
     </w:rPr>
   </w:style>
-  <w:style w:type="character" w:customStyle="1" w:styleId="AssuntodocomentrioChar">
+  <w:style w:type="character" w:styleId="AssuntodocomentrioChar" w:customStyle="1">
     <w:name w:val="Assunto do comentário Char"/>
     <w:basedOn w:val="TextodecomentrioChar"/>
     <w:link w:val="Assuntodocomentrio"/>
@@ -8636,7 +8656,7 @@
     <w:semiHidden/>
     <w:rsid w:val="00D04BD8"/>
     <w:rPr>
-      <w:rFonts w:ascii="Verdana" w:eastAsia="Times New Roman" w:hAnsi="Verdana" w:cs="Times New Roman"/>
+      <w:rFonts w:ascii="Verdana" w:hAnsi="Verdana" w:eastAsia="Times New Roman" w:cs="Times New Roman"/>
       <w:b/>
       <w:bCs/>
       <w:sz w:val="20"/>
@@ -8644,27 +8664,27 @@
       <w:lang w:val="x-none" w:eastAsia="x-none"/>
     </w:rPr>
   </w:style>
-  <w:style w:type="character" w:customStyle="1" w:styleId="cf01">
+  <w:style w:type="character" w:styleId="cf01" w:customStyle="1">
     <w:name w:val="cf01"/>
     <w:basedOn w:val="Fontepargpadro"/>
     <w:rsid w:val="00354AA2"/>
     <w:rPr>
-      <w:rFonts w:ascii="Segoe UI" w:hAnsi="Segoe UI" w:cs="Segoe UI" w:hint="default"/>
+      <w:rFonts w:hint="default" w:ascii="Segoe UI" w:hAnsi="Segoe UI" w:cs="Segoe UI"/>
       <w:sz w:val="18"/>
       <w:szCs w:val="18"/>
     </w:rPr>
   </w:style>
-  <w:style w:type="character" w:customStyle="1" w:styleId="normaltextrun">
+  <w:style w:type="character" w:styleId="normaltextrun" w:customStyle="1">
     <w:name w:val="normaltextrun"/>
     <w:basedOn w:val="Fontepargpadro"/>
     <w:rsid w:val="00661CF3"/>
   </w:style>
-  <w:style w:type="character" w:customStyle="1" w:styleId="eop">
+  <w:style w:type="character" w:styleId="eop" w:customStyle="1">
     <w:name w:val="eop"/>
     <w:basedOn w:val="Fontepargpadro"/>
     <w:rsid w:val="00661CF3"/>
   </w:style>
-  <w:style w:type="paragraph" w:customStyle="1" w:styleId="paragraph">
+  <w:style w:type="paragraph" w:styleId="paragraph" w:customStyle="1">
     <w:name w:val="paragraph"/>
     <w:basedOn w:val="Normal"/>
     <w:rsid w:val="0047216B"/>
@@ -8672,19 +8692,19 @@
       <w:spacing w:before="100" w:beforeAutospacing="1" w:after="100" w:afterAutospacing="1" w:line="240" w:lineRule="auto"/>
     </w:pPr>
     <w:rPr>
-      <w:rFonts w:ascii="Times New Roman" w:eastAsia="Times New Roman" w:hAnsi="Times New Roman" w:cs="Times New Roman"/>
+      <w:rFonts w:ascii="Times New Roman" w:hAnsi="Times New Roman" w:eastAsia="Times New Roman" w:cs="Times New Roman"/>
       <w:sz w:val="24"/>
       <w:szCs w:val="24"/>
       <w:lang w:eastAsia="pt-BR"/>
     </w:rPr>
   </w:style>
-  <w:style w:type="character" w:customStyle="1" w:styleId="Ttulo1Char">
+  <w:style w:type="character" w:styleId="Ttulo1Char" w:customStyle="1">
     <w:name w:val="Título 1 Char"/>
     <w:basedOn w:val="Fontepargpadro"/>
     <w:link w:val="Ttulo1"/>
     <w:rsid w:val="00012123"/>
     <w:rPr>
-      <w:rFonts w:ascii="Arial" w:eastAsia="Times New Roman" w:hAnsi="Arial" w:cs="Times New Roman"/>
+      <w:rFonts w:ascii="Arial" w:hAnsi="Arial" w:eastAsia="Times New Roman" w:cs="Times New Roman"/>
       <w:b/>
       <w:sz w:val="24"/>
       <w:szCs w:val="20"/>
@@ -8701,12 +8721,12 @@
       <w:u w:val="single"/>
     </w:rPr>
   </w:style>
-  <w:style w:type="character" w:customStyle="1" w:styleId="cf11">
+  <w:style w:type="character" w:styleId="cf11" w:customStyle="1">
     <w:name w:val="cf11"/>
     <w:basedOn w:val="Fontepargpadro"/>
     <w:rsid w:val="005B7851"/>
     <w:rPr>
-      <w:rFonts w:ascii="Segoe UI" w:hAnsi="Segoe UI" w:cs="Segoe UI" w:hint="default"/>
+      <w:rFonts w:hint="default" w:ascii="Segoe UI" w:hAnsi="Segoe UI" w:cs="Segoe UI"/>
       <w:b/>
       <w:bCs/>
       <w:sz w:val="18"/>
@@ -8742,12 +8762,12 @@
     </w:pPr>
     <w:tblPr>
       <w:tblBorders>
-        <w:top w:val="single" w:sz="4" w:space="0" w:color="000000" w:themeColor="text1"/>
-        <w:left w:val="single" w:sz="4" w:space="0" w:color="000000" w:themeColor="text1"/>
-        <w:bottom w:val="single" w:sz="4" w:space="0" w:color="000000" w:themeColor="text1"/>
-        <w:right w:val="single" w:sz="4" w:space="0" w:color="000000" w:themeColor="text1"/>
-        <w:insideH w:val="single" w:sz="4" w:space="0" w:color="000000" w:themeColor="text1"/>
-        <w:insideV w:val="single" w:sz="4" w:space="0" w:color="000000" w:themeColor="text1"/>
+        <w:top w:val="single" w:color="000000" w:themeColor="text1" w:sz="4" w:space="0"/>
+        <w:left w:val="single" w:color="000000" w:themeColor="text1" w:sz="4" w:space="0"/>
+        <w:bottom w:val="single" w:color="000000" w:themeColor="text1" w:sz="4" w:space="0"/>
+        <w:right w:val="single" w:color="000000" w:themeColor="text1" w:sz="4" w:space="0"/>
+        <w:insideH w:val="single" w:color="000000" w:themeColor="text1" w:sz="4" w:space="0"/>
+        <w:insideV w:val="single" w:color="000000" w:themeColor="text1" w:sz="4" w:space="0"/>
       </w:tblBorders>
     </w:tblPr>
   </w:style>
@@ -8766,7 +8786,7 @@
       <w:spacing w:after="0" w:line="240" w:lineRule="auto"/>
     </w:pPr>
   </w:style>
-  <w:style w:type="character" w:customStyle="1" w:styleId="CabealhoChar">
+  <w:style w:type="character" w:styleId="CabealhoChar" w:customStyle="1">
     <w:name w:val="Cabeçalho Char"/>
     <w:basedOn w:val="Fontepargpadro"/>
     <w:link w:val="Cabealho"/>
@@ -8788,7 +8808,7 @@
       <w:spacing w:after="0" w:line="240" w:lineRule="auto"/>
     </w:pPr>
   </w:style>
-  <w:style w:type="character" w:customStyle="1" w:styleId="RodapChar">
+  <w:style w:type="character" w:styleId="RodapChar" w:customStyle="1">
     <w:name w:val="Rodapé Char"/>
     <w:basedOn w:val="Fontepargpadro"/>
     <w:link w:val="Rodap"/>
@@ -8810,7 +8830,7 @@
       <w:textboxTightWrap w:val="allLines"/>
     </w:pPr>
     <w:rPr>
-      <w:rFonts w:ascii="Arial" w:eastAsia="Times New Roman" w:hAnsi="Arial" w:cs="Verdana"/>
+      <w:rFonts w:ascii="Arial" w:hAnsi="Arial" w:eastAsia="Times New Roman" w:cs="Verdana"/>
       <w:i/>
       <w:iCs/>
       <w:sz w:val="26"/>
@@ -8818,14 +8838,14 @@
       <w:lang w:eastAsia="zh-CN"/>
     </w:rPr>
   </w:style>
-  <w:style w:type="character" w:customStyle="1" w:styleId="CitaoChar">
+  <w:style w:type="character" w:styleId="CitaoChar" w:customStyle="1">
     <w:name w:val="Citação Char"/>
     <w:basedOn w:val="Fontepargpadro"/>
     <w:link w:val="Citao"/>
     <w:uiPriority w:val="29"/>
     <w:rsid w:val="00770E7F"/>
     <w:rPr>
-      <w:rFonts w:ascii="Arial" w:eastAsia="Times New Roman" w:hAnsi="Arial" w:cs="Verdana"/>
+      <w:rFonts w:ascii="Arial" w:hAnsi="Arial" w:eastAsia="Times New Roman" w:cs="Verdana"/>
       <w:i/>
       <w:iCs/>
       <w:sz w:val="26"/>
@@ -8843,7 +8863,7 @@
       <w:color w:val="808080"/>
     </w:rPr>
   </w:style>
-  <w:style w:type="paragraph" w:customStyle="1" w:styleId="Ttulos">
+  <w:style w:type="paragraph" w:styleId="Ttulos" w:customStyle="1">
     <w:name w:val="Títulos"/>
     <w:basedOn w:val="Citao"/>
     <w:link w:val="TtulosChar"/>
@@ -8862,13 +8882,13 @@
       <w:sz w:val="28"/>
     </w:rPr>
   </w:style>
-  <w:style w:type="character" w:customStyle="1" w:styleId="TtulosChar">
+  <w:style w:type="character" w:styleId="TtulosChar" w:customStyle="1">
     <w:name w:val="Títulos Char"/>
     <w:basedOn w:val="CitaoChar"/>
     <w:link w:val="Ttulos"/>
     <w:rsid w:val="002D127E"/>
     <w:rPr>
-      <w:rFonts w:ascii="Arial" w:eastAsia="Times New Roman" w:hAnsi="Arial" w:cs="Verdana"/>
+      <w:rFonts w:ascii="Arial" w:hAnsi="Arial" w:eastAsia="Times New Roman" w:cs="Verdana"/>
       <w:b/>
       <w:i w:val="0"/>
       <w:iCs/>
@@ -8888,7 +8908,7 @@
       <w:contextualSpacing/>
     </w:pPr>
   </w:style>
-  <w:style w:type="character" w:customStyle="1" w:styleId="Ttulo2Char">
+  <w:style w:type="character" w:styleId="Ttulo2Char" w:customStyle="1">
     <w:name w:val="Título 2 Char"/>
     <w:basedOn w:val="Fontepargpadro"/>
     <w:link w:val="Ttulo2"/>
@@ -8896,7 +8916,7 @@
     <w:semiHidden/>
     <w:rsid w:val="00F35250"/>
     <w:rPr>
-      <w:rFonts w:asciiTheme="majorHAnsi" w:eastAsiaTheme="majorEastAsia" w:hAnsiTheme="majorHAnsi" w:cstheme="majorBidi"/>
+      <w:rFonts w:asciiTheme="majorHAnsi" w:hAnsiTheme="majorHAnsi" w:eastAsiaTheme="majorEastAsia" w:cstheme="majorBidi"/>
       <w:color w:val="2F5496" w:themeColor="accent1" w:themeShade="BF"/>
       <w:sz w:val="26"/>
       <w:szCs w:val="26"/>
@@ -9650,7 +9670,7 @@
 </file>
 
 <file path=word/theme/theme1.xml><?xml version="1.0" encoding="utf-8"?>
-<a:theme xmlns:a="http://schemas.openxmlformats.org/drawingml/2006/main" name="Tema do Office">
+<a:theme xmlns:a="http://schemas.openxmlformats.org/drawingml/2006/main" xmlns:thm15="http://schemas.microsoft.com/office/thememl/2012/main" name="Tema do Office">
   <a:themeElements>
     <a:clrScheme name="Office">
       <a:dk1>

</xml_diff>